<commit_message>
feat(cand): proposed-order template (template-gap fill from the notice donor, docx from motion-brief); fix(docx): no-break hyphen as hyphen + word joiner, not w:noBreakHyphen (LibreOffice drew U+2011 in a fallback font, DEF-FONT-002)
- courts/.../northern-district/proposed-order: typst + docx, judge signature from frontmatter judge:{name,title,dated}
  or a trailing rule + [Hon. Name, Title]; counsel block optional; numbered paragraphs as body paragraphs.
  3 filed N.D. Cal. exemplars (FTC v. Block 1-2, Cal. Nurses v. Mullin 80-3, Salles v. NIH 33-1); typst 16/16, docx 22/22.
- lib/docx/xengine.lua: DEF-FONT-002 now passes on cand answer/complaint/proposed-order, dc district complaint,
  ED Ark. motion-brief, ca8 answering-brief, ca9 answering-brief (sampled; each failed it before).
- cand answer: drop case-specific example text from a comment (fb lint ngram); README gap 1 closed.
- tracker READMEs regenerated.
</commit_message>
<xml_diff>
--- a/courts/ninth-circuit/california/federal/northern-district/answer/usage/OUTPUT-answer.docx
+++ b/courts/ninth-circuit/california/federal/northern-district/answer/usage/OUTPUT-answer.docx
@@ -224,9 +224,7 @@
         <w:t xml:space="preserve"> </w:t>
       </w:r>
       <w:r>
-        <w:t xml:space="preserve">565</w:t>
-        <w:noBreakHyphen/>
-        <w:t xml:space="preserve">2900</w:t>
+        <w:t xml:space="preserve">565-⁠2900</w:t>
       </w:r>
     </w:p>
     <w:p>
@@ -248,9 +246,7 @@
         <w:t xml:space="preserve"> </w:t>
       </w:r>
       <w:r>
-        <w:t xml:space="preserve">920</w:t>
-        <w:noBreakHyphen/>
-        <w:t xml:space="preserve">4402</w:t>
+        <w:t xml:space="preserve">920-⁠4402</w:t>
       </w:r>
     </w:p>
     <w:p>
@@ -496,9 +492,7 @@
                     <w:t xml:space="preserve"> </w:t>
                   </w:r>
                   <w:r>
-                    <w:t xml:space="preserve">1</w:t>
-                    <w:noBreakHyphen/>
-                    <w:t xml:space="preserve">10,</w:t>
+                    <w:t xml:space="preserve">1-⁠10,</w:t>
                   </w:r>
                   <w:r>
                     <w:t xml:space="preserve"> </w:t>
@@ -545,9 +539,7 @@
               <w:t xml:space="preserve">Case No. </w:t>
             </w:r>
             <w:r>
-              <w:t xml:space="preserve">26-cv</w:t>
-              <w:noBreakHyphen/>
-              <w:t xml:space="preserve">07387-EKL</w:t>
+              <w:t xml:space="preserve">26-cv-⁠07387-EKL</w:t>
             </w:r>
           </w:p>
           <w:p>
@@ -6959,9 +6951,7 @@
         <w:sz w:val="20"/>
         <w:szCs w:val="20"/>
       </w:rPr>
-      <w:t xml:space="preserve">CASE NO. 26-cv</w:t>
-      <w:noBreakHyphen/>
-      <w:t xml:space="preserve">07387-EKL</w:t>
+      <w:t xml:space="preserve">CASE NO. 26-cv-⁠07387-EKL</w:t>
     </w:r>
   </w:p>
 </w:ftr>

</xml_diff>